<commit_message>
Move inline styles to style.css; update CVs
Extracted the inline style block from index.html into a new external style.css and replaced the embedded <style> with a <link rel="stylesheet" href="style.css" />. Added style.css containing the same styles (hero gradient, cards, skill items, training cards, contact and footer styles). Also includes updated binary CV files (Sygnorey_Jazze_Q_Azuma_CV.docx and .pdf).
</commit_message>
<xml_diff>
--- a/Sygnorey_Jazze_Q_Azuma_CV.docx
+++ b/Sygnorey_Jazze_Q_Azuma_CV.docx
@@ -8,59 +8,26 @@
         <w:ind w:left="0" w:right="20" w:firstLine="0"/>
         <w:jc w:val="center"/>
         <w:rPr>
+          <w:sz w:val="48"/>
+          <w:szCs w:val="48"/>
+        </w:rPr>
+      </w:pPr>
+      <w:r>
+        <w:rPr>
           <w:b/>
-          <w:sz w:val="14"/>
-          <w:szCs w:val="14"/>
+          <w:sz w:val="48"/>
+          <w:szCs w:val="48"/>
         </w:rPr>
-      </w:pPr>
+        <w:t>SYGNOREY JAZZE Q. AZUMA</w:t>
+      </w:r>
     </w:p>
     <w:p>
       <w:pPr>
-        <w:spacing w:after="0" w:line="276" w:lineRule="auto"/>
-        <w:ind w:left="0" w:right="20" w:firstLine="0"/>
-        <w:jc w:val="center"/>
-        <w:rPr>
-          <w:sz w:val="44"/>
-          <w:szCs w:val="44"/>
-        </w:rPr>
-      </w:pPr>
-      <w:r>
-        <w:rPr>
-          <w:b/>
-          <w:sz w:val="44"/>
-          <w:szCs w:val="44"/>
-        </w:rPr>
-        <w:t>SYGNOREY JAZZE Q. AZUMA</w:t>
-      </w:r>
-    </w:p>
-    <w:p>
-      <w:pPr>
         <w:spacing w:after="23" w:line="276" w:lineRule="auto"/>
         <w:jc w:val="center"/>
       </w:pPr>
-      <w:proofErr w:type="spellStart"/>
-      <w:r>
-        <w:t>Brgy</w:t>
-      </w:r>
-      <w:proofErr w:type="spellEnd"/>
-      <w:r>
-        <w:t xml:space="preserve">. </w:t>
-      </w:r>
-      <w:proofErr w:type="spellStart"/>
-      <w:r>
-        <w:t>Dongalo</w:t>
-      </w:r>
-      <w:proofErr w:type="spellEnd"/>
-      <w:r>
-        <w:t xml:space="preserve">, San Ildefonso, </w:t>
-      </w:r>
-      <w:proofErr w:type="spellStart"/>
-      <w:r>
-        <w:t>Ilocos</w:t>
-      </w:r>
-      <w:proofErr w:type="spellEnd"/>
-      <w:r>
-        <w:t xml:space="preserve"> Sur </w:t>
+      <w:r>
+        <w:t xml:space="preserve">Brgy. Dongalo, San Ildefonso, Ilocos Sur </w:t>
       </w:r>
     </w:p>
     <w:p>
@@ -85,18 +52,9 @@
         <w:t>|</w:t>
       </w:r>
       <w:r>
-        <w:t xml:space="preserve"> 09278016602 | </w:t>
-      </w:r>
-      <w:proofErr w:type="spellStart"/>
-      <w:r>
-        <w:t>Github</w:t>
-      </w:r>
-      <w:proofErr w:type="spellEnd"/>
-      <w:r>
-        <w:t xml:space="preserve"> </w:t>
+        <w:t xml:space="preserve"> 09278016602 | Github </w:t>
       </w:r>
       <w:hyperlink r:id="rId7">
-        <w:proofErr w:type="spellStart"/>
         <w:r>
           <w:rPr>
             <w:color w:val="0563C1"/>
@@ -104,7 +62,6 @@
           </w:rPr>
           <w:t>Jazumazaiko</w:t>
         </w:r>
-        <w:proofErr w:type="spellEnd"/>
       </w:hyperlink>
       <w:hyperlink r:id="rId8">
         <w:r>
@@ -237,15 +194,7 @@
         <w:ind w:right="1452"/>
       </w:pPr>
       <w:r>
-        <w:t xml:space="preserve">University of Northern Philippines (UNP), City of Vigan, </w:t>
-      </w:r>
-      <w:proofErr w:type="spellStart"/>
-      <w:r>
-        <w:t>Ilocos</w:t>
-      </w:r>
-      <w:proofErr w:type="spellEnd"/>
-      <w:r>
-        <w:t xml:space="preserve"> Sur </w:t>
+        <w:t xml:space="preserve">University of Northern Philippines (UNP), City of Vigan, Ilocos Sur </w:t>
       </w:r>
     </w:p>
     <w:p>
@@ -344,15 +293,7 @@
         <w:ind w:right="1649"/>
       </w:pPr>
       <w:r>
-        <w:t xml:space="preserve">Divine Word College of Vigan (DWCV), City of Vigan, </w:t>
-      </w:r>
-      <w:proofErr w:type="spellStart"/>
-      <w:r>
-        <w:t>Ilocos</w:t>
-      </w:r>
-      <w:proofErr w:type="spellEnd"/>
-      <w:r>
-        <w:t xml:space="preserve"> Sur </w:t>
+        <w:t xml:space="preserve">Divine Word College of Vigan (DWCV), City of Vigan, Ilocos Sur </w:t>
       </w:r>
     </w:p>
     <w:p>
@@ -405,21 +346,8 @@
         <w:spacing w:line="276" w:lineRule="auto"/>
         <w:ind w:right="0"/>
       </w:pPr>
-      <w:proofErr w:type="spellStart"/>
-      <w:r>
-        <w:t>Sagsagat</w:t>
-      </w:r>
-      <w:proofErr w:type="spellEnd"/>
-      <w:r>
-        <w:t xml:space="preserve"> Elementary School, San Ildefonso, </w:t>
-      </w:r>
-      <w:proofErr w:type="spellStart"/>
-      <w:r>
-        <w:t>Ilocos</w:t>
-      </w:r>
-      <w:proofErr w:type="spellEnd"/>
-      <w:r>
-        <w:t xml:space="preserve"> Sur </w:t>
+      <w:r>
+        <w:t xml:space="preserve">Sagsagat Elementary School, San Ildefonso, Ilocos Sur </w:t>
       </w:r>
     </w:p>
     <w:p>
@@ -536,15 +464,7 @@
         <w:t>Databases:</w:t>
       </w:r>
       <w:r>
-        <w:t xml:space="preserve"> MySQL, XAMPP, </w:t>
-      </w:r>
-      <w:proofErr w:type="spellStart"/>
-      <w:r>
-        <w:t>HeidiSQL</w:t>
-      </w:r>
-      <w:proofErr w:type="spellEnd"/>
-      <w:r>
-        <w:t xml:space="preserve"> </w:t>
+        <w:t xml:space="preserve"> MySQL, XAMPP, HeidiSQL </w:t>
       </w:r>
     </w:p>
     <w:p>
@@ -695,6 +615,118 @@
       <w:pPr>
         <w:pStyle w:val="NoSpacing"/>
       </w:pPr>
+    </w:p>
+    <w:p>
+      <w:pPr>
+        <w:spacing w:line="276" w:lineRule="auto"/>
+        <w:rPr>
+          <w:b/>
+          <w:bCs/>
+          <w:i/>
+          <w:iCs/>
+        </w:rPr>
+      </w:pPr>
+      <w:r>
+        <w:rPr>
+          <w:b/>
+          <w:bCs/>
+          <w:i/>
+          <w:iCs/>
+        </w:rPr>
+        <w:t>LANGUAGES:</w:t>
+      </w:r>
+    </w:p>
+    <w:p>
+      <w:pPr>
+        <w:pStyle w:val="ListParagraph"/>
+        <w:numPr>
+          <w:ilvl w:val="0"/>
+          <w:numId w:val="41"/>
+        </w:numPr>
+        <w:spacing w:line="276" w:lineRule="auto"/>
+        <w:rPr>
+          <w:b/>
+          <w:bCs/>
+          <w:i/>
+          <w:iCs/>
+        </w:rPr>
+      </w:pPr>
+      <w:r>
+        <w:rPr>
+          <w:i/>
+          <w:iCs/>
+        </w:rPr>
+        <w:t>Filipino (Native</w:t>
+      </w:r>
+      <w:r>
+        <w:rPr>
+          <w:b/>
+          <w:bCs/>
+          <w:i/>
+          <w:iCs/>
+        </w:rPr>
+        <w:t>)</w:t>
+      </w:r>
+    </w:p>
+    <w:p>
+      <w:pPr>
+        <w:pStyle w:val="ListParagraph"/>
+        <w:numPr>
+          <w:ilvl w:val="0"/>
+          <w:numId w:val="41"/>
+        </w:numPr>
+        <w:spacing w:line="276" w:lineRule="auto"/>
+        <w:rPr>
+          <w:b/>
+          <w:bCs/>
+          <w:i/>
+          <w:iCs/>
+        </w:rPr>
+      </w:pPr>
+      <w:r>
+        <w:rPr>
+          <w:i/>
+          <w:iCs/>
+        </w:rPr>
+        <w:t>Ilocano (Native)</w:t>
+      </w:r>
+    </w:p>
+    <w:p>
+      <w:pPr>
+        <w:pStyle w:val="ListParagraph"/>
+        <w:numPr>
+          <w:ilvl w:val="0"/>
+          <w:numId w:val="41"/>
+        </w:numPr>
+        <w:spacing w:line="276" w:lineRule="auto"/>
+        <w:rPr>
+          <w:b/>
+          <w:bCs/>
+          <w:i/>
+          <w:iCs/>
+        </w:rPr>
+      </w:pPr>
+      <w:r>
+        <w:rPr>
+          <w:i/>
+          <w:iCs/>
+        </w:rPr>
+        <w:t xml:space="preserve">English (Working </w:t>
+      </w:r>
+      <w:r>
+        <w:rPr>
+          <w:i/>
+          <w:iCs/>
+        </w:rPr>
+        <w:t>Proficiency</w:t>
+      </w:r>
+      <w:r>
+        <w:rPr>
+          <w:i/>
+          <w:iCs/>
+        </w:rPr>
+        <w:t>)</w:t>
+      </w:r>
     </w:p>
     <w:p>
       <w:pPr>
@@ -1044,7 +1076,6 @@
     </w:p>
     <w:p>
       <w:pPr>
-        <w:pStyle w:val="NoSpacing"/>
         <w:spacing w:line="276" w:lineRule="auto"/>
       </w:pPr>
     </w:p>
@@ -1068,51 +1099,108 @@
           <w:i/>
           <w:iCs/>
         </w:rPr>
-        <w:t>ADDITIONAL</w:t>
+        <w:t>WORK EXPERIENCE</w:t>
       </w:r>
     </w:p>
     <w:p>
       <w:pPr>
-        <w:pStyle w:val="ListParagraph"/>
+        <w:pStyle w:val="NoSpacing"/>
+        <w:spacing w:line="276" w:lineRule="auto"/>
+        <w:rPr>
+          <w:b/>
+          <w:bCs/>
+          <w:i/>
+          <w:iCs/>
+        </w:rPr>
+      </w:pPr>
+      <w:r>
+        <w:rPr>
+          <w:b/>
+          <w:bCs/>
+          <w:i/>
+          <w:iCs/>
+        </w:rPr>
+        <w:t>Legislative Intern | Provincial Government of Ilocos Sur</w:t>
+      </w:r>
+      <w:r>
+        <w:rPr>
+          <w:b/>
+          <w:bCs/>
+          <w:i/>
+          <w:iCs/>
+        </w:rPr>
+        <w:br/>
+        <w:t>January 2026 – May 2026</w:t>
+      </w:r>
+    </w:p>
+    <w:p>
+      <w:pPr>
+        <w:pStyle w:val="NoSpacing"/>
         <w:numPr>
           <w:ilvl w:val="0"/>
-          <w:numId w:val="35"/>
+          <w:numId w:val="40"/>
         </w:numPr>
         <w:spacing w:line="276" w:lineRule="auto"/>
       </w:pPr>
       <w:r>
-        <w:t xml:space="preserve">Available for internship or entry-level roles. </w:t>
+        <w:t>Drafted and iteratively refined an inventory management system outline (features, data entry fields, reporting format) based on supervisor feedback, demonstrating requirements gathering and documentation skills.</w:t>
       </w:r>
     </w:p>
     <w:p>
       <w:pPr>
-        <w:pStyle w:val="ListParagraph"/>
+        <w:pStyle w:val="NoSpacing"/>
         <w:numPr>
           <w:ilvl w:val="0"/>
-          <w:numId w:val="28"/>
+          <w:numId w:val="40"/>
         </w:numPr>
         <w:spacing w:line="276" w:lineRule="auto"/>
       </w:pPr>
       <w:r>
-        <w:t>Code samples available upon request.</w:t>
+        <w:t>Maintained a digital Excel logbook for 100+ official documents (ordinances, resolutions, committee reports), tracked distribution and counter-signatures across multiple offices, and created a checklist that reduced missing items.</w:t>
       </w:r>
     </w:p>
     <w:p>
       <w:pPr>
-        <w:pStyle w:val="ListParagraph"/>
+        <w:pStyle w:val="NoSpacing"/>
         <w:numPr>
           <w:ilvl w:val="0"/>
-          <w:numId w:val="28"/>
+          <w:numId w:val="40"/>
         </w:numPr>
         <w:spacing w:line="276" w:lineRule="auto"/>
       </w:pPr>
       <w:r>
-        <w:t>Fluent in Tagalog.</w:t>
+        <w:t>Operated and troubleshot high-volume office equipment (duplex printing 5,890+ pages, scanning, photocopying), resolving paper jams and ensuring document integrity.</w:t>
+      </w:r>
+    </w:p>
+    <w:p>
+      <w:pPr>
+        <w:pStyle w:val="NoSpacing"/>
+        <w:numPr>
+          <w:ilvl w:val="0"/>
+          <w:numId w:val="40"/>
+        </w:numPr>
+        <w:spacing w:line="276" w:lineRule="auto"/>
+      </w:pPr>
+      <w:r>
+        <w:t>Served as a reliable liaison for cross-office transactions (CSC, Sports Office, Secretariat), honing professional communication and coordination skills under tight deadlines.</w:t>
+      </w:r>
+    </w:p>
+    <w:p>
+      <w:pPr>
+        <w:pStyle w:val="NoSpacing"/>
+        <w:numPr>
+          <w:ilvl w:val="0"/>
+          <w:numId w:val="40"/>
+        </w:numPr>
+        <w:spacing w:line="276" w:lineRule="auto"/>
+      </w:pPr>
+      <w:r>
+        <w:t>Supported technical discussions on a proposed flood monitoring system by taking notes and reviewing features, displaying curiosity in IT solutions for public service.</w:t>
       </w:r>
     </w:p>
     <w:sectPr>
       <w:pgSz w:w="11906" w:h="16838" w:code="9"/>
-      <w:pgMar w:top="752" w:right="1431" w:bottom="1452" w:left="1440" w:header="720" w:footer="720" w:gutter="0"/>
+      <w:pgMar w:top="720" w:right="720" w:bottom="720" w:left="720" w:header="720" w:footer="720" w:gutter="0"/>
       <w:cols w:space="720"/>
       <w:docGrid w:linePitch="326"/>
     </w:sectPr>
@@ -1498,6 +1586,119 @@
     </w:lvl>
   </w:abstractNum>
   <w:abstractNum w:abstractNumId="2" w15:restartNumberingAfterBreak="0">
+    <w:nsid w:val="0B446FBC"/>
+    <w:multiLevelType w:val="hybridMultilevel"/>
+    <w:tmpl w:val="94EC8D92"/>
+    <w:lvl w:ilvl="0" w:tplc="34090001">
+      <w:start w:val="1"/>
+      <w:numFmt w:val="bullet"/>
+      <w:lvlText w:val=""/>
+      <w:lvlJc w:val="left"/>
+      <w:pPr>
+        <w:ind w:left="720" w:hanging="360"/>
+      </w:pPr>
+      <w:rPr>
+        <w:rFonts w:ascii="Symbol" w:hAnsi="Symbol" w:hint="default"/>
+      </w:rPr>
+    </w:lvl>
+    <w:lvl w:ilvl="1" w:tplc="34090003" w:tentative="1">
+      <w:start w:val="1"/>
+      <w:numFmt w:val="bullet"/>
+      <w:lvlText w:val="o"/>
+      <w:lvlJc w:val="left"/>
+      <w:pPr>
+        <w:ind w:left="1440" w:hanging="360"/>
+      </w:pPr>
+      <w:rPr>
+        <w:rFonts w:ascii="Courier New" w:hAnsi="Courier New" w:cs="Courier New" w:hint="default"/>
+      </w:rPr>
+    </w:lvl>
+    <w:lvl w:ilvl="2" w:tplc="34090005" w:tentative="1">
+      <w:start w:val="1"/>
+      <w:numFmt w:val="bullet"/>
+      <w:lvlText w:val=""/>
+      <w:lvlJc w:val="left"/>
+      <w:pPr>
+        <w:ind w:left="2160" w:hanging="360"/>
+      </w:pPr>
+      <w:rPr>
+        <w:rFonts w:ascii="Wingdings" w:hAnsi="Wingdings" w:hint="default"/>
+      </w:rPr>
+    </w:lvl>
+    <w:lvl w:ilvl="3" w:tplc="34090001" w:tentative="1">
+      <w:start w:val="1"/>
+      <w:numFmt w:val="bullet"/>
+      <w:lvlText w:val=""/>
+      <w:lvlJc w:val="left"/>
+      <w:pPr>
+        <w:ind w:left="2880" w:hanging="360"/>
+      </w:pPr>
+      <w:rPr>
+        <w:rFonts w:ascii="Symbol" w:hAnsi="Symbol" w:hint="default"/>
+      </w:rPr>
+    </w:lvl>
+    <w:lvl w:ilvl="4" w:tplc="34090003" w:tentative="1">
+      <w:start w:val="1"/>
+      <w:numFmt w:val="bullet"/>
+      <w:lvlText w:val="o"/>
+      <w:lvlJc w:val="left"/>
+      <w:pPr>
+        <w:ind w:left="3600" w:hanging="360"/>
+      </w:pPr>
+      <w:rPr>
+        <w:rFonts w:ascii="Courier New" w:hAnsi="Courier New" w:cs="Courier New" w:hint="default"/>
+      </w:rPr>
+    </w:lvl>
+    <w:lvl w:ilvl="5" w:tplc="34090005" w:tentative="1">
+      <w:start w:val="1"/>
+      <w:numFmt w:val="bullet"/>
+      <w:lvlText w:val=""/>
+      <w:lvlJc w:val="left"/>
+      <w:pPr>
+        <w:ind w:left="4320" w:hanging="360"/>
+      </w:pPr>
+      <w:rPr>
+        <w:rFonts w:ascii="Wingdings" w:hAnsi="Wingdings" w:hint="default"/>
+      </w:rPr>
+    </w:lvl>
+    <w:lvl w:ilvl="6" w:tplc="34090001" w:tentative="1">
+      <w:start w:val="1"/>
+      <w:numFmt w:val="bullet"/>
+      <w:lvlText w:val=""/>
+      <w:lvlJc w:val="left"/>
+      <w:pPr>
+        <w:ind w:left="5040" w:hanging="360"/>
+      </w:pPr>
+      <w:rPr>
+        <w:rFonts w:ascii="Symbol" w:hAnsi="Symbol" w:hint="default"/>
+      </w:rPr>
+    </w:lvl>
+    <w:lvl w:ilvl="7" w:tplc="34090003" w:tentative="1">
+      <w:start w:val="1"/>
+      <w:numFmt w:val="bullet"/>
+      <w:lvlText w:val="o"/>
+      <w:lvlJc w:val="left"/>
+      <w:pPr>
+        <w:ind w:left="5760" w:hanging="360"/>
+      </w:pPr>
+      <w:rPr>
+        <w:rFonts w:ascii="Courier New" w:hAnsi="Courier New" w:cs="Courier New" w:hint="default"/>
+      </w:rPr>
+    </w:lvl>
+    <w:lvl w:ilvl="8" w:tplc="34090005" w:tentative="1">
+      <w:start w:val="1"/>
+      <w:numFmt w:val="bullet"/>
+      <w:lvlText w:val=""/>
+      <w:lvlJc w:val="left"/>
+      <w:pPr>
+        <w:ind w:left="6480" w:hanging="360"/>
+      </w:pPr>
+      <w:rPr>
+        <w:rFonts w:ascii="Wingdings" w:hAnsi="Wingdings" w:hint="default"/>
+      </w:rPr>
+    </w:lvl>
+  </w:abstractNum>
+  <w:abstractNum w:abstractNumId="3" w15:restartNumberingAfterBreak="0">
     <w:nsid w:val="0C455770"/>
     <w:multiLevelType w:val="hybridMultilevel"/>
     <w:tmpl w:val="76BED2F0"/>
@@ -1610,7 +1811,7 @@
       </w:rPr>
     </w:lvl>
   </w:abstractNum>
-  <w:abstractNum w:abstractNumId="3" w15:restartNumberingAfterBreak="0">
+  <w:abstractNum w:abstractNumId="4" w15:restartNumberingAfterBreak="0">
     <w:nsid w:val="0D6F7D6D"/>
     <w:multiLevelType w:val="hybridMultilevel"/>
     <w:tmpl w:val="60E495D4"/>
@@ -1822,7 +2023,7 @@
       </w:rPr>
     </w:lvl>
   </w:abstractNum>
-  <w:abstractNum w:abstractNumId="4" w15:restartNumberingAfterBreak="0">
+  <w:abstractNum w:abstractNumId="5" w15:restartNumberingAfterBreak="0">
     <w:nsid w:val="0E6869D7"/>
     <w:multiLevelType w:val="hybridMultilevel"/>
     <w:tmpl w:val="4E7434D2"/>
@@ -1936,7 +2137,7 @@
       </w:rPr>
     </w:lvl>
   </w:abstractNum>
-  <w:abstractNum w:abstractNumId="5" w15:restartNumberingAfterBreak="0">
+  <w:abstractNum w:abstractNumId="6" w15:restartNumberingAfterBreak="0">
     <w:nsid w:val="10E97402"/>
     <w:multiLevelType w:val="hybridMultilevel"/>
     <w:tmpl w:val="9EBC2FD4"/>
@@ -2049,7 +2250,7 @@
       </w:rPr>
     </w:lvl>
   </w:abstractNum>
-  <w:abstractNum w:abstractNumId="6" w15:restartNumberingAfterBreak="0">
+  <w:abstractNum w:abstractNumId="7" w15:restartNumberingAfterBreak="0">
     <w:nsid w:val="13D450BA"/>
     <w:multiLevelType w:val="hybridMultilevel"/>
     <w:tmpl w:val="91667D5A"/>
@@ -2162,7 +2363,7 @@
       </w:rPr>
     </w:lvl>
   </w:abstractNum>
-  <w:abstractNum w:abstractNumId="7" w15:restartNumberingAfterBreak="0">
+  <w:abstractNum w:abstractNumId="8" w15:restartNumberingAfterBreak="0">
     <w:nsid w:val="165D3585"/>
     <w:multiLevelType w:val="hybridMultilevel"/>
     <w:tmpl w:val="293ADDE4"/>
@@ -2248,7 +2449,7 @@
       </w:pPr>
     </w:lvl>
   </w:abstractNum>
-  <w:abstractNum w:abstractNumId="8" w15:restartNumberingAfterBreak="0">
+  <w:abstractNum w:abstractNumId="9" w15:restartNumberingAfterBreak="0">
     <w:nsid w:val="1799070C"/>
     <w:multiLevelType w:val="hybridMultilevel"/>
     <w:tmpl w:val="75B04032"/>
@@ -2460,7 +2661,156 @@
       </w:rPr>
     </w:lvl>
   </w:abstractNum>
-  <w:abstractNum w:abstractNumId="9" w15:restartNumberingAfterBreak="0">
+  <w:abstractNum w:abstractNumId="10" w15:restartNumberingAfterBreak="0">
+    <w:nsid w:val="17CE5C4E"/>
+    <w:multiLevelType w:val="multilevel"/>
+    <w:tmpl w:val="D9C2A6F8"/>
+    <w:lvl w:ilvl="0">
+      <w:start w:val="1"/>
+      <w:numFmt w:val="bullet"/>
+      <w:lvlText w:val=""/>
+      <w:lvlJc w:val="left"/>
+      <w:pPr>
+        <w:tabs>
+          <w:tab w:val="num" w:pos="720"/>
+        </w:tabs>
+        <w:ind w:left="720" w:hanging="360"/>
+      </w:pPr>
+      <w:rPr>
+        <w:rFonts w:ascii="Symbol" w:hAnsi="Symbol" w:hint="default"/>
+        <w:sz w:val="20"/>
+      </w:rPr>
+    </w:lvl>
+    <w:lvl w:ilvl="1" w:tentative="1">
+      <w:start w:val="1"/>
+      <w:numFmt w:val="bullet"/>
+      <w:lvlText w:val="o"/>
+      <w:lvlJc w:val="left"/>
+      <w:pPr>
+        <w:tabs>
+          <w:tab w:val="num" w:pos="1440"/>
+        </w:tabs>
+        <w:ind w:left="1440" w:hanging="360"/>
+      </w:pPr>
+      <w:rPr>
+        <w:rFonts w:ascii="Courier New" w:hAnsi="Courier New" w:hint="default"/>
+        <w:sz w:val="20"/>
+      </w:rPr>
+    </w:lvl>
+    <w:lvl w:ilvl="2" w:tentative="1">
+      <w:start w:val="1"/>
+      <w:numFmt w:val="bullet"/>
+      <w:lvlText w:val=""/>
+      <w:lvlJc w:val="left"/>
+      <w:pPr>
+        <w:tabs>
+          <w:tab w:val="num" w:pos="2160"/>
+        </w:tabs>
+        <w:ind w:left="2160" w:hanging="360"/>
+      </w:pPr>
+      <w:rPr>
+        <w:rFonts w:ascii="Wingdings" w:hAnsi="Wingdings" w:hint="default"/>
+        <w:sz w:val="20"/>
+      </w:rPr>
+    </w:lvl>
+    <w:lvl w:ilvl="3" w:tentative="1">
+      <w:start w:val="1"/>
+      <w:numFmt w:val="bullet"/>
+      <w:lvlText w:val=""/>
+      <w:lvlJc w:val="left"/>
+      <w:pPr>
+        <w:tabs>
+          <w:tab w:val="num" w:pos="2880"/>
+        </w:tabs>
+        <w:ind w:left="2880" w:hanging="360"/>
+      </w:pPr>
+      <w:rPr>
+        <w:rFonts w:ascii="Wingdings" w:hAnsi="Wingdings" w:hint="default"/>
+        <w:sz w:val="20"/>
+      </w:rPr>
+    </w:lvl>
+    <w:lvl w:ilvl="4" w:tentative="1">
+      <w:start w:val="1"/>
+      <w:numFmt w:val="bullet"/>
+      <w:lvlText w:val=""/>
+      <w:lvlJc w:val="left"/>
+      <w:pPr>
+        <w:tabs>
+          <w:tab w:val="num" w:pos="3600"/>
+        </w:tabs>
+        <w:ind w:left="3600" w:hanging="360"/>
+      </w:pPr>
+      <w:rPr>
+        <w:rFonts w:ascii="Wingdings" w:hAnsi="Wingdings" w:hint="default"/>
+        <w:sz w:val="20"/>
+      </w:rPr>
+    </w:lvl>
+    <w:lvl w:ilvl="5" w:tentative="1">
+      <w:start w:val="1"/>
+      <w:numFmt w:val="bullet"/>
+      <w:lvlText w:val=""/>
+      <w:lvlJc w:val="left"/>
+      <w:pPr>
+        <w:tabs>
+          <w:tab w:val="num" w:pos="4320"/>
+        </w:tabs>
+        <w:ind w:left="4320" w:hanging="360"/>
+      </w:pPr>
+      <w:rPr>
+        <w:rFonts w:ascii="Wingdings" w:hAnsi="Wingdings" w:hint="default"/>
+        <w:sz w:val="20"/>
+      </w:rPr>
+    </w:lvl>
+    <w:lvl w:ilvl="6" w:tentative="1">
+      <w:start w:val="1"/>
+      <w:numFmt w:val="bullet"/>
+      <w:lvlText w:val=""/>
+      <w:lvlJc w:val="left"/>
+      <w:pPr>
+        <w:tabs>
+          <w:tab w:val="num" w:pos="5040"/>
+        </w:tabs>
+        <w:ind w:left="5040" w:hanging="360"/>
+      </w:pPr>
+      <w:rPr>
+        <w:rFonts w:ascii="Wingdings" w:hAnsi="Wingdings" w:hint="default"/>
+        <w:sz w:val="20"/>
+      </w:rPr>
+    </w:lvl>
+    <w:lvl w:ilvl="7" w:tentative="1">
+      <w:start w:val="1"/>
+      <w:numFmt w:val="bullet"/>
+      <w:lvlText w:val=""/>
+      <w:lvlJc w:val="left"/>
+      <w:pPr>
+        <w:tabs>
+          <w:tab w:val="num" w:pos="5760"/>
+        </w:tabs>
+        <w:ind w:left="5760" w:hanging="360"/>
+      </w:pPr>
+      <w:rPr>
+        <w:rFonts w:ascii="Wingdings" w:hAnsi="Wingdings" w:hint="default"/>
+        <w:sz w:val="20"/>
+      </w:rPr>
+    </w:lvl>
+    <w:lvl w:ilvl="8" w:tentative="1">
+      <w:start w:val="1"/>
+      <w:numFmt w:val="bullet"/>
+      <w:lvlText w:val=""/>
+      <w:lvlJc w:val="left"/>
+      <w:pPr>
+        <w:tabs>
+          <w:tab w:val="num" w:pos="6480"/>
+        </w:tabs>
+        <w:ind w:left="6480" w:hanging="360"/>
+      </w:pPr>
+      <w:rPr>
+        <w:rFonts w:ascii="Wingdings" w:hAnsi="Wingdings" w:hint="default"/>
+        <w:sz w:val="20"/>
+      </w:rPr>
+    </w:lvl>
+  </w:abstractNum>
+  <w:abstractNum w:abstractNumId="11" w15:restartNumberingAfterBreak="0">
     <w:nsid w:val="1A124B8B"/>
     <w:multiLevelType w:val="hybridMultilevel"/>
     <w:tmpl w:val="A4B0A35E"/>
@@ -2573,7 +2923,120 @@
       </w:rPr>
     </w:lvl>
   </w:abstractNum>
-  <w:abstractNum w:abstractNumId="10" w15:restartNumberingAfterBreak="0">
+  <w:abstractNum w:abstractNumId="12" w15:restartNumberingAfterBreak="0">
+    <w:nsid w:val="1B8C0445"/>
+    <w:multiLevelType w:val="hybridMultilevel"/>
+    <w:tmpl w:val="DC541578"/>
+    <w:lvl w:ilvl="0" w:tplc="34090001">
+      <w:start w:val="1"/>
+      <w:numFmt w:val="bullet"/>
+      <w:lvlText w:val=""/>
+      <w:lvlJc w:val="left"/>
+      <w:pPr>
+        <w:ind w:left="720" w:hanging="360"/>
+      </w:pPr>
+      <w:rPr>
+        <w:rFonts w:ascii="Symbol" w:hAnsi="Symbol" w:hint="default"/>
+      </w:rPr>
+    </w:lvl>
+    <w:lvl w:ilvl="1" w:tplc="34090003">
+      <w:start w:val="1"/>
+      <w:numFmt w:val="bullet"/>
+      <w:lvlText w:val="o"/>
+      <w:lvlJc w:val="left"/>
+      <w:pPr>
+        <w:ind w:left="1440" w:hanging="360"/>
+      </w:pPr>
+      <w:rPr>
+        <w:rFonts w:ascii="Courier New" w:hAnsi="Courier New" w:cs="Courier New" w:hint="default"/>
+      </w:rPr>
+    </w:lvl>
+    <w:lvl w:ilvl="2" w:tplc="34090005" w:tentative="1">
+      <w:start w:val="1"/>
+      <w:numFmt w:val="bullet"/>
+      <w:lvlText w:val=""/>
+      <w:lvlJc w:val="left"/>
+      <w:pPr>
+        <w:ind w:left="2160" w:hanging="360"/>
+      </w:pPr>
+      <w:rPr>
+        <w:rFonts w:ascii="Wingdings" w:hAnsi="Wingdings" w:hint="default"/>
+      </w:rPr>
+    </w:lvl>
+    <w:lvl w:ilvl="3" w:tplc="34090001" w:tentative="1">
+      <w:start w:val="1"/>
+      <w:numFmt w:val="bullet"/>
+      <w:lvlText w:val=""/>
+      <w:lvlJc w:val="left"/>
+      <w:pPr>
+        <w:ind w:left="2880" w:hanging="360"/>
+      </w:pPr>
+      <w:rPr>
+        <w:rFonts w:ascii="Symbol" w:hAnsi="Symbol" w:hint="default"/>
+      </w:rPr>
+    </w:lvl>
+    <w:lvl w:ilvl="4" w:tplc="34090003" w:tentative="1">
+      <w:start w:val="1"/>
+      <w:numFmt w:val="bullet"/>
+      <w:lvlText w:val="o"/>
+      <w:lvlJc w:val="left"/>
+      <w:pPr>
+        <w:ind w:left="3600" w:hanging="360"/>
+      </w:pPr>
+      <w:rPr>
+        <w:rFonts w:ascii="Courier New" w:hAnsi="Courier New" w:cs="Courier New" w:hint="default"/>
+      </w:rPr>
+    </w:lvl>
+    <w:lvl w:ilvl="5" w:tplc="34090005" w:tentative="1">
+      <w:start w:val="1"/>
+      <w:numFmt w:val="bullet"/>
+      <w:lvlText w:val=""/>
+      <w:lvlJc w:val="left"/>
+      <w:pPr>
+        <w:ind w:left="4320" w:hanging="360"/>
+      </w:pPr>
+      <w:rPr>
+        <w:rFonts w:ascii="Wingdings" w:hAnsi="Wingdings" w:hint="default"/>
+      </w:rPr>
+    </w:lvl>
+    <w:lvl w:ilvl="6" w:tplc="34090001" w:tentative="1">
+      <w:start w:val="1"/>
+      <w:numFmt w:val="bullet"/>
+      <w:lvlText w:val=""/>
+      <w:lvlJc w:val="left"/>
+      <w:pPr>
+        <w:ind w:left="5040" w:hanging="360"/>
+      </w:pPr>
+      <w:rPr>
+        <w:rFonts w:ascii="Symbol" w:hAnsi="Symbol" w:hint="default"/>
+      </w:rPr>
+    </w:lvl>
+    <w:lvl w:ilvl="7" w:tplc="34090003" w:tentative="1">
+      <w:start w:val="1"/>
+      <w:numFmt w:val="bullet"/>
+      <w:lvlText w:val="o"/>
+      <w:lvlJc w:val="left"/>
+      <w:pPr>
+        <w:ind w:left="5760" w:hanging="360"/>
+      </w:pPr>
+      <w:rPr>
+        <w:rFonts w:ascii="Courier New" w:hAnsi="Courier New" w:cs="Courier New" w:hint="default"/>
+      </w:rPr>
+    </w:lvl>
+    <w:lvl w:ilvl="8" w:tplc="34090005" w:tentative="1">
+      <w:start w:val="1"/>
+      <w:numFmt w:val="bullet"/>
+      <w:lvlText w:val=""/>
+      <w:lvlJc w:val="left"/>
+      <w:pPr>
+        <w:ind w:left="6480" w:hanging="360"/>
+      </w:pPr>
+      <w:rPr>
+        <w:rFonts w:ascii="Wingdings" w:hAnsi="Wingdings" w:hint="default"/>
+      </w:rPr>
+    </w:lvl>
+  </w:abstractNum>
+  <w:abstractNum w:abstractNumId="13" w15:restartNumberingAfterBreak="0">
     <w:nsid w:val="1D1D2653"/>
     <w:multiLevelType w:val="hybridMultilevel"/>
     <w:tmpl w:val="FF04EF8E"/>
@@ -2785,7 +3248,7 @@
       </w:rPr>
     </w:lvl>
   </w:abstractNum>
-  <w:abstractNum w:abstractNumId="11" w15:restartNumberingAfterBreak="0">
+  <w:abstractNum w:abstractNumId="14" w15:restartNumberingAfterBreak="0">
     <w:nsid w:val="2385590A"/>
     <w:multiLevelType w:val="hybridMultilevel"/>
     <w:tmpl w:val="EB42E73E"/>
@@ -2898,7 +3361,7 @@
       </w:rPr>
     </w:lvl>
   </w:abstractNum>
-  <w:abstractNum w:abstractNumId="12" w15:restartNumberingAfterBreak="0">
+  <w:abstractNum w:abstractNumId="15" w15:restartNumberingAfterBreak="0">
     <w:nsid w:val="27470F7C"/>
     <w:multiLevelType w:val="hybridMultilevel"/>
     <w:tmpl w:val="06FA01EE"/>
@@ -3012,7 +3475,7 @@
       </w:rPr>
     </w:lvl>
   </w:abstractNum>
-  <w:abstractNum w:abstractNumId="13" w15:restartNumberingAfterBreak="0">
+  <w:abstractNum w:abstractNumId="16" w15:restartNumberingAfterBreak="0">
     <w:nsid w:val="2A7347B2"/>
     <w:multiLevelType w:val="hybridMultilevel"/>
     <w:tmpl w:val="957C536C"/>
@@ -3127,7 +3590,7 @@
       </w:rPr>
     </w:lvl>
   </w:abstractNum>
-  <w:abstractNum w:abstractNumId="14" w15:restartNumberingAfterBreak="0">
+  <w:abstractNum w:abstractNumId="17" w15:restartNumberingAfterBreak="0">
     <w:nsid w:val="2D7D5121"/>
     <w:multiLevelType w:val="hybridMultilevel"/>
     <w:tmpl w:val="698A342E"/>
@@ -3213,7 +3676,7 @@
       </w:pPr>
     </w:lvl>
   </w:abstractNum>
-  <w:abstractNum w:abstractNumId="15" w15:restartNumberingAfterBreak="0">
+  <w:abstractNum w:abstractNumId="18" w15:restartNumberingAfterBreak="0">
     <w:nsid w:val="2F0D419C"/>
     <w:multiLevelType w:val="hybridMultilevel"/>
     <w:tmpl w:val="993C30F2"/>
@@ -3326,7 +3789,7 @@
       </w:rPr>
     </w:lvl>
   </w:abstractNum>
-  <w:abstractNum w:abstractNumId="16" w15:restartNumberingAfterBreak="0">
+  <w:abstractNum w:abstractNumId="19" w15:restartNumberingAfterBreak="0">
     <w:nsid w:val="30FA2571"/>
     <w:multiLevelType w:val="hybridMultilevel"/>
     <w:tmpl w:val="40206AE4"/>
@@ -3439,7 +3902,7 @@
       </w:rPr>
     </w:lvl>
   </w:abstractNum>
-  <w:abstractNum w:abstractNumId="17" w15:restartNumberingAfterBreak="0">
+  <w:abstractNum w:abstractNumId="20" w15:restartNumberingAfterBreak="0">
     <w:nsid w:val="327C7C03"/>
     <w:multiLevelType w:val="hybridMultilevel"/>
     <w:tmpl w:val="87F64F7E"/>
@@ -3552,7 +4015,7 @@
       </w:rPr>
     </w:lvl>
   </w:abstractNum>
-  <w:abstractNum w:abstractNumId="18" w15:restartNumberingAfterBreak="0">
+  <w:abstractNum w:abstractNumId="21" w15:restartNumberingAfterBreak="0">
     <w:nsid w:val="38F13737"/>
     <w:multiLevelType w:val="hybridMultilevel"/>
     <w:tmpl w:val="FDA41A2A"/>
@@ -3764,7 +4227,7 @@
       </w:rPr>
     </w:lvl>
   </w:abstractNum>
-  <w:abstractNum w:abstractNumId="19" w15:restartNumberingAfterBreak="0">
+  <w:abstractNum w:abstractNumId="22" w15:restartNumberingAfterBreak="0">
     <w:nsid w:val="3A505736"/>
     <w:multiLevelType w:val="hybridMultilevel"/>
     <w:tmpl w:val="534E6F48"/>
@@ -3976,7 +4439,7 @@
       </w:rPr>
     </w:lvl>
   </w:abstractNum>
-  <w:abstractNum w:abstractNumId="20" w15:restartNumberingAfterBreak="0">
+  <w:abstractNum w:abstractNumId="23" w15:restartNumberingAfterBreak="0">
     <w:nsid w:val="3DA355BF"/>
     <w:multiLevelType w:val="hybridMultilevel"/>
     <w:tmpl w:val="A566D968"/>
@@ -4188,7 +4651,7 @@
       </w:rPr>
     </w:lvl>
   </w:abstractNum>
-  <w:abstractNum w:abstractNumId="21" w15:restartNumberingAfterBreak="0">
+  <w:abstractNum w:abstractNumId="24" w15:restartNumberingAfterBreak="0">
     <w:nsid w:val="46FE4812"/>
     <w:multiLevelType w:val="hybridMultilevel"/>
     <w:tmpl w:val="454C08A8"/>
@@ -4400,7 +4863,120 @@
       </w:rPr>
     </w:lvl>
   </w:abstractNum>
-  <w:abstractNum w:abstractNumId="22" w15:restartNumberingAfterBreak="0">
+  <w:abstractNum w:abstractNumId="25" w15:restartNumberingAfterBreak="0">
+    <w:nsid w:val="4A0578DD"/>
+    <w:multiLevelType w:val="hybridMultilevel"/>
+    <w:tmpl w:val="ED0A2542"/>
+    <w:lvl w:ilvl="0" w:tplc="34090001">
+      <w:start w:val="1"/>
+      <w:numFmt w:val="bullet"/>
+      <w:lvlText w:val=""/>
+      <w:lvlJc w:val="left"/>
+      <w:pPr>
+        <w:ind w:left="720" w:hanging="360"/>
+      </w:pPr>
+      <w:rPr>
+        <w:rFonts w:ascii="Symbol" w:hAnsi="Symbol" w:hint="default"/>
+      </w:rPr>
+    </w:lvl>
+    <w:lvl w:ilvl="1" w:tplc="34090003" w:tentative="1">
+      <w:start w:val="1"/>
+      <w:numFmt w:val="bullet"/>
+      <w:lvlText w:val="o"/>
+      <w:lvlJc w:val="left"/>
+      <w:pPr>
+        <w:ind w:left="1440" w:hanging="360"/>
+      </w:pPr>
+      <w:rPr>
+        <w:rFonts w:ascii="Courier New" w:hAnsi="Courier New" w:cs="Courier New" w:hint="default"/>
+      </w:rPr>
+    </w:lvl>
+    <w:lvl w:ilvl="2" w:tplc="34090005" w:tentative="1">
+      <w:start w:val="1"/>
+      <w:numFmt w:val="bullet"/>
+      <w:lvlText w:val=""/>
+      <w:lvlJc w:val="left"/>
+      <w:pPr>
+        <w:ind w:left="2160" w:hanging="360"/>
+      </w:pPr>
+      <w:rPr>
+        <w:rFonts w:ascii="Wingdings" w:hAnsi="Wingdings" w:hint="default"/>
+      </w:rPr>
+    </w:lvl>
+    <w:lvl w:ilvl="3" w:tplc="34090001" w:tentative="1">
+      <w:start w:val="1"/>
+      <w:numFmt w:val="bullet"/>
+      <w:lvlText w:val=""/>
+      <w:lvlJc w:val="left"/>
+      <w:pPr>
+        <w:ind w:left="2880" w:hanging="360"/>
+      </w:pPr>
+      <w:rPr>
+        <w:rFonts w:ascii="Symbol" w:hAnsi="Symbol" w:hint="default"/>
+      </w:rPr>
+    </w:lvl>
+    <w:lvl w:ilvl="4" w:tplc="34090003" w:tentative="1">
+      <w:start w:val="1"/>
+      <w:numFmt w:val="bullet"/>
+      <w:lvlText w:val="o"/>
+      <w:lvlJc w:val="left"/>
+      <w:pPr>
+        <w:ind w:left="3600" w:hanging="360"/>
+      </w:pPr>
+      <w:rPr>
+        <w:rFonts w:ascii="Courier New" w:hAnsi="Courier New" w:cs="Courier New" w:hint="default"/>
+      </w:rPr>
+    </w:lvl>
+    <w:lvl w:ilvl="5" w:tplc="34090005" w:tentative="1">
+      <w:start w:val="1"/>
+      <w:numFmt w:val="bullet"/>
+      <w:lvlText w:val=""/>
+      <w:lvlJc w:val="left"/>
+      <w:pPr>
+        <w:ind w:left="4320" w:hanging="360"/>
+      </w:pPr>
+      <w:rPr>
+        <w:rFonts w:ascii="Wingdings" w:hAnsi="Wingdings" w:hint="default"/>
+      </w:rPr>
+    </w:lvl>
+    <w:lvl w:ilvl="6" w:tplc="34090001" w:tentative="1">
+      <w:start w:val="1"/>
+      <w:numFmt w:val="bullet"/>
+      <w:lvlText w:val=""/>
+      <w:lvlJc w:val="left"/>
+      <w:pPr>
+        <w:ind w:left="5040" w:hanging="360"/>
+      </w:pPr>
+      <w:rPr>
+        <w:rFonts w:ascii="Symbol" w:hAnsi="Symbol" w:hint="default"/>
+      </w:rPr>
+    </w:lvl>
+    <w:lvl w:ilvl="7" w:tplc="34090003" w:tentative="1">
+      <w:start w:val="1"/>
+      <w:numFmt w:val="bullet"/>
+      <w:lvlText w:val="o"/>
+      <w:lvlJc w:val="left"/>
+      <w:pPr>
+        <w:ind w:left="5760" w:hanging="360"/>
+      </w:pPr>
+      <w:rPr>
+        <w:rFonts w:ascii="Courier New" w:hAnsi="Courier New" w:cs="Courier New" w:hint="default"/>
+      </w:rPr>
+    </w:lvl>
+    <w:lvl w:ilvl="8" w:tplc="34090005" w:tentative="1">
+      <w:start w:val="1"/>
+      <w:numFmt w:val="bullet"/>
+      <w:lvlText w:val=""/>
+      <w:lvlJc w:val="left"/>
+      <w:pPr>
+        <w:ind w:left="6480" w:hanging="360"/>
+      </w:pPr>
+      <w:rPr>
+        <w:rFonts w:ascii="Wingdings" w:hAnsi="Wingdings" w:hint="default"/>
+      </w:rPr>
+    </w:lvl>
+  </w:abstractNum>
+  <w:abstractNum w:abstractNumId="26" w15:restartNumberingAfterBreak="0">
     <w:nsid w:val="4B373C41"/>
     <w:multiLevelType w:val="hybridMultilevel"/>
     <w:tmpl w:val="9E7EC440"/>
@@ -4612,7 +5188,7 @@
       </w:rPr>
     </w:lvl>
   </w:abstractNum>
-  <w:abstractNum w:abstractNumId="23" w15:restartNumberingAfterBreak="0">
+  <w:abstractNum w:abstractNumId="27" w15:restartNumberingAfterBreak="0">
     <w:nsid w:val="54DD69FC"/>
     <w:multiLevelType w:val="hybridMultilevel"/>
     <w:tmpl w:val="1BC4891C"/>
@@ -4725,7 +5301,269 @@
       </w:rPr>
     </w:lvl>
   </w:abstractNum>
-  <w:abstractNum w:abstractNumId="24" w15:restartNumberingAfterBreak="0">
+  <w:abstractNum w:abstractNumId="28" w15:restartNumberingAfterBreak="0">
+    <w:nsid w:val="554D34A7"/>
+    <w:multiLevelType w:val="hybridMultilevel"/>
+    <w:tmpl w:val="3E5A5670"/>
+    <w:lvl w:ilvl="0" w:tplc="34090001">
+      <w:start w:val="1"/>
+      <w:numFmt w:val="bullet"/>
+      <w:lvlText w:val=""/>
+      <w:lvlJc w:val="left"/>
+      <w:pPr>
+        <w:ind w:left="720" w:hanging="360"/>
+      </w:pPr>
+      <w:rPr>
+        <w:rFonts w:ascii="Symbol" w:hAnsi="Symbol" w:hint="default"/>
+      </w:rPr>
+    </w:lvl>
+    <w:lvl w:ilvl="1" w:tplc="34090003" w:tentative="1">
+      <w:start w:val="1"/>
+      <w:numFmt w:val="bullet"/>
+      <w:lvlText w:val="o"/>
+      <w:lvlJc w:val="left"/>
+      <w:pPr>
+        <w:ind w:left="1440" w:hanging="360"/>
+      </w:pPr>
+      <w:rPr>
+        <w:rFonts w:ascii="Courier New" w:hAnsi="Courier New" w:cs="Courier New" w:hint="default"/>
+      </w:rPr>
+    </w:lvl>
+    <w:lvl w:ilvl="2" w:tplc="34090005" w:tentative="1">
+      <w:start w:val="1"/>
+      <w:numFmt w:val="bullet"/>
+      <w:lvlText w:val=""/>
+      <w:lvlJc w:val="left"/>
+      <w:pPr>
+        <w:ind w:left="2160" w:hanging="360"/>
+      </w:pPr>
+      <w:rPr>
+        <w:rFonts w:ascii="Wingdings" w:hAnsi="Wingdings" w:hint="default"/>
+      </w:rPr>
+    </w:lvl>
+    <w:lvl w:ilvl="3" w:tplc="34090001" w:tentative="1">
+      <w:start w:val="1"/>
+      <w:numFmt w:val="bullet"/>
+      <w:lvlText w:val=""/>
+      <w:lvlJc w:val="left"/>
+      <w:pPr>
+        <w:ind w:left="2880" w:hanging="360"/>
+      </w:pPr>
+      <w:rPr>
+        <w:rFonts w:ascii="Symbol" w:hAnsi="Symbol" w:hint="default"/>
+      </w:rPr>
+    </w:lvl>
+    <w:lvl w:ilvl="4" w:tplc="34090003" w:tentative="1">
+      <w:start w:val="1"/>
+      <w:numFmt w:val="bullet"/>
+      <w:lvlText w:val="o"/>
+      <w:lvlJc w:val="left"/>
+      <w:pPr>
+        <w:ind w:left="3600" w:hanging="360"/>
+      </w:pPr>
+      <w:rPr>
+        <w:rFonts w:ascii="Courier New" w:hAnsi="Courier New" w:cs="Courier New" w:hint="default"/>
+      </w:rPr>
+    </w:lvl>
+    <w:lvl w:ilvl="5" w:tplc="34090005" w:tentative="1">
+      <w:start w:val="1"/>
+      <w:numFmt w:val="bullet"/>
+      <w:lvlText w:val=""/>
+      <w:lvlJc w:val="left"/>
+      <w:pPr>
+        <w:ind w:left="4320" w:hanging="360"/>
+      </w:pPr>
+      <w:rPr>
+        <w:rFonts w:ascii="Wingdings" w:hAnsi="Wingdings" w:hint="default"/>
+      </w:rPr>
+    </w:lvl>
+    <w:lvl w:ilvl="6" w:tplc="34090001" w:tentative="1">
+      <w:start w:val="1"/>
+      <w:numFmt w:val="bullet"/>
+      <w:lvlText w:val=""/>
+      <w:lvlJc w:val="left"/>
+      <w:pPr>
+        <w:ind w:left="5040" w:hanging="360"/>
+      </w:pPr>
+      <w:rPr>
+        <w:rFonts w:ascii="Symbol" w:hAnsi="Symbol" w:hint="default"/>
+      </w:rPr>
+    </w:lvl>
+    <w:lvl w:ilvl="7" w:tplc="34090003" w:tentative="1">
+      <w:start w:val="1"/>
+      <w:numFmt w:val="bullet"/>
+      <w:lvlText w:val="o"/>
+      <w:lvlJc w:val="left"/>
+      <w:pPr>
+        <w:ind w:left="5760" w:hanging="360"/>
+      </w:pPr>
+      <w:rPr>
+        <w:rFonts w:ascii="Courier New" w:hAnsi="Courier New" w:cs="Courier New" w:hint="default"/>
+      </w:rPr>
+    </w:lvl>
+    <w:lvl w:ilvl="8" w:tplc="34090005" w:tentative="1">
+      <w:start w:val="1"/>
+      <w:numFmt w:val="bullet"/>
+      <w:lvlText w:val=""/>
+      <w:lvlJc w:val="left"/>
+      <w:pPr>
+        <w:ind w:left="6480" w:hanging="360"/>
+      </w:pPr>
+      <w:rPr>
+        <w:rFonts w:ascii="Wingdings" w:hAnsi="Wingdings" w:hint="default"/>
+      </w:rPr>
+    </w:lvl>
+  </w:abstractNum>
+  <w:abstractNum w:abstractNumId="29" w15:restartNumberingAfterBreak="0">
+    <w:nsid w:val="56263AB4"/>
+    <w:multiLevelType w:val="multilevel"/>
+    <w:tmpl w:val="9460C95E"/>
+    <w:lvl w:ilvl="0">
+      <w:start w:val="1"/>
+      <w:numFmt w:val="bullet"/>
+      <w:lvlText w:val=""/>
+      <w:lvlJc w:val="left"/>
+      <w:pPr>
+        <w:tabs>
+          <w:tab w:val="num" w:pos="720"/>
+        </w:tabs>
+        <w:ind w:left="720" w:hanging="360"/>
+      </w:pPr>
+      <w:rPr>
+        <w:rFonts w:ascii="Symbol" w:hAnsi="Symbol" w:hint="default"/>
+        <w:sz w:val="20"/>
+      </w:rPr>
+    </w:lvl>
+    <w:lvl w:ilvl="1" w:tentative="1">
+      <w:start w:val="1"/>
+      <w:numFmt w:val="bullet"/>
+      <w:lvlText w:val="o"/>
+      <w:lvlJc w:val="left"/>
+      <w:pPr>
+        <w:tabs>
+          <w:tab w:val="num" w:pos="1440"/>
+        </w:tabs>
+        <w:ind w:left="1440" w:hanging="360"/>
+      </w:pPr>
+      <w:rPr>
+        <w:rFonts w:ascii="Courier New" w:hAnsi="Courier New" w:hint="default"/>
+        <w:sz w:val="20"/>
+      </w:rPr>
+    </w:lvl>
+    <w:lvl w:ilvl="2" w:tentative="1">
+      <w:start w:val="1"/>
+      <w:numFmt w:val="bullet"/>
+      <w:lvlText w:val=""/>
+      <w:lvlJc w:val="left"/>
+      <w:pPr>
+        <w:tabs>
+          <w:tab w:val="num" w:pos="2160"/>
+        </w:tabs>
+        <w:ind w:left="2160" w:hanging="360"/>
+      </w:pPr>
+      <w:rPr>
+        <w:rFonts w:ascii="Wingdings" w:hAnsi="Wingdings" w:hint="default"/>
+        <w:sz w:val="20"/>
+      </w:rPr>
+    </w:lvl>
+    <w:lvl w:ilvl="3" w:tentative="1">
+      <w:start w:val="1"/>
+      <w:numFmt w:val="bullet"/>
+      <w:lvlText w:val=""/>
+      <w:lvlJc w:val="left"/>
+      <w:pPr>
+        <w:tabs>
+          <w:tab w:val="num" w:pos="2880"/>
+        </w:tabs>
+        <w:ind w:left="2880" w:hanging="360"/>
+      </w:pPr>
+      <w:rPr>
+        <w:rFonts w:ascii="Wingdings" w:hAnsi="Wingdings" w:hint="default"/>
+        <w:sz w:val="20"/>
+      </w:rPr>
+    </w:lvl>
+    <w:lvl w:ilvl="4" w:tentative="1">
+      <w:start w:val="1"/>
+      <w:numFmt w:val="bullet"/>
+      <w:lvlText w:val=""/>
+      <w:lvlJc w:val="left"/>
+      <w:pPr>
+        <w:tabs>
+          <w:tab w:val="num" w:pos="3600"/>
+        </w:tabs>
+        <w:ind w:left="3600" w:hanging="360"/>
+      </w:pPr>
+      <w:rPr>
+        <w:rFonts w:ascii="Wingdings" w:hAnsi="Wingdings" w:hint="default"/>
+        <w:sz w:val="20"/>
+      </w:rPr>
+    </w:lvl>
+    <w:lvl w:ilvl="5" w:tentative="1">
+      <w:start w:val="1"/>
+      <w:numFmt w:val="bullet"/>
+      <w:lvlText w:val=""/>
+      <w:lvlJc w:val="left"/>
+      <w:pPr>
+        <w:tabs>
+          <w:tab w:val="num" w:pos="4320"/>
+        </w:tabs>
+        <w:ind w:left="4320" w:hanging="360"/>
+      </w:pPr>
+      <w:rPr>
+        <w:rFonts w:ascii="Wingdings" w:hAnsi="Wingdings" w:hint="default"/>
+        <w:sz w:val="20"/>
+      </w:rPr>
+    </w:lvl>
+    <w:lvl w:ilvl="6" w:tentative="1">
+      <w:start w:val="1"/>
+      <w:numFmt w:val="bullet"/>
+      <w:lvlText w:val=""/>
+      <w:lvlJc w:val="left"/>
+      <w:pPr>
+        <w:tabs>
+          <w:tab w:val="num" w:pos="5040"/>
+        </w:tabs>
+        <w:ind w:left="5040" w:hanging="360"/>
+      </w:pPr>
+      <w:rPr>
+        <w:rFonts w:ascii="Wingdings" w:hAnsi="Wingdings" w:hint="default"/>
+        <w:sz w:val="20"/>
+      </w:rPr>
+    </w:lvl>
+    <w:lvl w:ilvl="7" w:tentative="1">
+      <w:start w:val="1"/>
+      <w:numFmt w:val="bullet"/>
+      <w:lvlText w:val=""/>
+      <w:lvlJc w:val="left"/>
+      <w:pPr>
+        <w:tabs>
+          <w:tab w:val="num" w:pos="5760"/>
+        </w:tabs>
+        <w:ind w:left="5760" w:hanging="360"/>
+      </w:pPr>
+      <w:rPr>
+        <w:rFonts w:ascii="Wingdings" w:hAnsi="Wingdings" w:hint="default"/>
+        <w:sz w:val="20"/>
+      </w:rPr>
+    </w:lvl>
+    <w:lvl w:ilvl="8" w:tentative="1">
+      <w:start w:val="1"/>
+      <w:numFmt w:val="bullet"/>
+      <w:lvlText w:val=""/>
+      <w:lvlJc w:val="left"/>
+      <w:pPr>
+        <w:tabs>
+          <w:tab w:val="num" w:pos="6480"/>
+        </w:tabs>
+        <w:ind w:left="6480" w:hanging="360"/>
+      </w:pPr>
+      <w:rPr>
+        <w:rFonts w:ascii="Wingdings" w:hAnsi="Wingdings" w:hint="default"/>
+        <w:sz w:val="20"/>
+      </w:rPr>
+    </w:lvl>
+  </w:abstractNum>
+  <w:abstractNum w:abstractNumId="30" w15:restartNumberingAfterBreak="0">
     <w:nsid w:val="5B0B0EEA"/>
     <w:multiLevelType w:val="hybridMultilevel"/>
     <w:tmpl w:val="51A0D57C"/>
@@ -4937,7 +5775,7 @@
       </w:rPr>
     </w:lvl>
   </w:abstractNum>
-  <w:abstractNum w:abstractNumId="25" w15:restartNumberingAfterBreak="0">
+  <w:abstractNum w:abstractNumId="31" w15:restartNumberingAfterBreak="0">
     <w:nsid w:val="5D263DD6"/>
     <w:multiLevelType w:val="hybridMultilevel"/>
     <w:tmpl w:val="3B00034A"/>
@@ -5023,7 +5861,7 @@
       </w:pPr>
     </w:lvl>
   </w:abstractNum>
-  <w:abstractNum w:abstractNumId="26" w15:restartNumberingAfterBreak="0">
+  <w:abstractNum w:abstractNumId="32" w15:restartNumberingAfterBreak="0">
     <w:nsid w:val="65C8764B"/>
     <w:multiLevelType w:val="hybridMultilevel"/>
     <w:tmpl w:val="F07EB04A"/>
@@ -5136,7 +5974,7 @@
       </w:rPr>
     </w:lvl>
   </w:abstractNum>
-  <w:abstractNum w:abstractNumId="27" w15:restartNumberingAfterBreak="0">
+  <w:abstractNum w:abstractNumId="33" w15:restartNumberingAfterBreak="0">
     <w:nsid w:val="663B3863"/>
     <w:multiLevelType w:val="hybridMultilevel"/>
     <w:tmpl w:val="07EAE99A"/>
@@ -5348,7 +6186,7 @@
       </w:rPr>
     </w:lvl>
   </w:abstractNum>
-  <w:abstractNum w:abstractNumId="28" w15:restartNumberingAfterBreak="0">
+  <w:abstractNum w:abstractNumId="34" w15:restartNumberingAfterBreak="0">
     <w:nsid w:val="68AD0535"/>
     <w:multiLevelType w:val="hybridMultilevel"/>
     <w:tmpl w:val="791CB25E"/>
@@ -5560,7 +6398,7 @@
       </w:rPr>
     </w:lvl>
   </w:abstractNum>
-  <w:abstractNum w:abstractNumId="29" w15:restartNumberingAfterBreak="0">
+  <w:abstractNum w:abstractNumId="35" w15:restartNumberingAfterBreak="0">
     <w:nsid w:val="693310C3"/>
     <w:multiLevelType w:val="hybridMultilevel"/>
     <w:tmpl w:val="72A0E07E"/>
@@ -5673,7 +6511,7 @@
       </w:rPr>
     </w:lvl>
   </w:abstractNum>
-  <w:abstractNum w:abstractNumId="30" w15:restartNumberingAfterBreak="0">
+  <w:abstractNum w:abstractNumId="36" w15:restartNumberingAfterBreak="0">
     <w:nsid w:val="6C293E4F"/>
     <w:multiLevelType w:val="hybridMultilevel"/>
     <w:tmpl w:val="CE9E1FDC"/>
@@ -5885,7 +6723,7 @@
       </w:rPr>
     </w:lvl>
   </w:abstractNum>
-  <w:abstractNum w:abstractNumId="31" w15:restartNumberingAfterBreak="0">
+  <w:abstractNum w:abstractNumId="37" w15:restartNumberingAfterBreak="0">
     <w:nsid w:val="6F1F3D73"/>
     <w:multiLevelType w:val="hybridMultilevel"/>
     <w:tmpl w:val="5E86B72A"/>
@@ -5998,7 +6836,7 @@
       </w:rPr>
     </w:lvl>
   </w:abstractNum>
-  <w:abstractNum w:abstractNumId="32" w15:restartNumberingAfterBreak="0">
+  <w:abstractNum w:abstractNumId="38" w15:restartNumberingAfterBreak="0">
     <w:nsid w:val="77886D69"/>
     <w:multiLevelType w:val="hybridMultilevel"/>
     <w:tmpl w:val="606A576E"/>
@@ -6110,7 +6948,7 @@
       </w:rPr>
     </w:lvl>
   </w:abstractNum>
-  <w:abstractNum w:abstractNumId="33" w15:restartNumberingAfterBreak="0">
+  <w:abstractNum w:abstractNumId="39" w15:restartNumberingAfterBreak="0">
     <w:nsid w:val="791B5B75"/>
     <w:multiLevelType w:val="hybridMultilevel"/>
     <w:tmpl w:val="D9B47C34"/>
@@ -6223,7 +7061,7 @@
       </w:rPr>
     </w:lvl>
   </w:abstractNum>
-  <w:abstractNum w:abstractNumId="34" w15:restartNumberingAfterBreak="0">
+  <w:abstractNum w:abstractNumId="40" w15:restartNumberingAfterBreak="0">
     <w:nsid w:val="79951510"/>
     <w:multiLevelType w:val="hybridMultilevel"/>
     <w:tmpl w:val="7610E36C"/>
@@ -6455,109 +7293,127 @@
     </w:lvl>
   </w:abstractNum>
   <w:num w:numId="1" w16cid:durableId="722295300">
+    <w:abstractNumId w:val="30"/>
+  </w:num>
+  <w:num w:numId="2" w16cid:durableId="54744446">
+    <w:abstractNumId w:val="13"/>
+  </w:num>
+  <w:num w:numId="3" w16cid:durableId="1926649405">
+    <w:abstractNumId w:val="26"/>
+  </w:num>
+  <w:num w:numId="4" w16cid:durableId="593590441">
     <w:abstractNumId w:val="24"/>
   </w:num>
-  <w:num w:numId="2" w16cid:durableId="54744446">
-    <w:abstractNumId w:val="10"/>
-  </w:num>
-  <w:num w:numId="3" w16cid:durableId="1926649405">
-    <w:abstractNumId w:val="22"/>
-  </w:num>
-  <w:num w:numId="4" w16cid:durableId="593590441">
+  <w:num w:numId="5" w16cid:durableId="581069342">
     <w:abstractNumId w:val="21"/>
-  </w:num>
-  <w:num w:numId="5" w16cid:durableId="581069342">
-    <w:abstractNumId w:val="18"/>
   </w:num>
   <w:num w:numId="6" w16cid:durableId="118650524">
     <w:abstractNumId w:val="0"/>
   </w:num>
   <w:num w:numId="7" w16cid:durableId="749693143">
-    <w:abstractNumId w:val="34"/>
+    <w:abstractNumId w:val="40"/>
   </w:num>
   <w:num w:numId="8" w16cid:durableId="1631352923">
     <w:abstractNumId w:val="1"/>
   </w:num>
   <w:num w:numId="9" w16cid:durableId="1701970567">
+    <w:abstractNumId w:val="15"/>
+  </w:num>
+  <w:num w:numId="10" w16cid:durableId="233635996">
+    <w:abstractNumId w:val="5"/>
+  </w:num>
+  <w:num w:numId="11" w16cid:durableId="678393355">
+    <w:abstractNumId w:val="16"/>
+  </w:num>
+  <w:num w:numId="12" w16cid:durableId="1473400964">
+    <w:abstractNumId w:val="3"/>
+  </w:num>
+  <w:num w:numId="13" w16cid:durableId="3747947">
+    <w:abstractNumId w:val="38"/>
+  </w:num>
+  <w:num w:numId="14" w16cid:durableId="1760905303">
+    <w:abstractNumId w:val="33"/>
+  </w:num>
+  <w:num w:numId="15" w16cid:durableId="41179656">
+    <w:abstractNumId w:val="34"/>
+  </w:num>
+  <w:num w:numId="16" w16cid:durableId="1724980417">
+    <w:abstractNumId w:val="31"/>
+  </w:num>
+  <w:num w:numId="17" w16cid:durableId="262499182">
+    <w:abstractNumId w:val="9"/>
+  </w:num>
+  <w:num w:numId="18" w16cid:durableId="1396001935">
+    <w:abstractNumId w:val="23"/>
+  </w:num>
+  <w:num w:numId="19" w16cid:durableId="741563133">
+    <w:abstractNumId w:val="36"/>
+  </w:num>
+  <w:num w:numId="20" w16cid:durableId="472645796">
+    <w:abstractNumId w:val="18"/>
+  </w:num>
+  <w:num w:numId="21" w16cid:durableId="834146167">
+    <w:abstractNumId w:val="27"/>
+  </w:num>
+  <w:num w:numId="22" w16cid:durableId="1771077427">
+    <w:abstractNumId w:val="22"/>
+  </w:num>
+  <w:num w:numId="23" w16cid:durableId="347222887">
+    <w:abstractNumId w:val="4"/>
+  </w:num>
+  <w:num w:numId="24" w16cid:durableId="601575226">
+    <w:abstractNumId w:val="11"/>
+  </w:num>
+  <w:num w:numId="25" w16cid:durableId="236943186">
+    <w:abstractNumId w:val="35"/>
+  </w:num>
+  <w:num w:numId="26" w16cid:durableId="641467891">
+    <w:abstractNumId w:val="32"/>
+  </w:num>
+  <w:num w:numId="27" w16cid:durableId="41487736">
+    <w:abstractNumId w:val="37"/>
+  </w:num>
+  <w:num w:numId="28" w16cid:durableId="1080713305">
+    <w:abstractNumId w:val="6"/>
+  </w:num>
+  <w:num w:numId="29" w16cid:durableId="1864399801">
+    <w:abstractNumId w:val="19"/>
+  </w:num>
+  <w:num w:numId="30" w16cid:durableId="762797186">
+    <w:abstractNumId w:val="14"/>
+  </w:num>
+  <w:num w:numId="31" w16cid:durableId="805586371">
+    <w:abstractNumId w:val="7"/>
+  </w:num>
+  <w:num w:numId="32" w16cid:durableId="310523437">
+    <w:abstractNumId w:val="8"/>
+  </w:num>
+  <w:num w:numId="33" w16cid:durableId="1100218768">
+    <w:abstractNumId w:val="17"/>
+  </w:num>
+  <w:num w:numId="34" w16cid:durableId="83109092">
+    <w:abstractNumId w:val="39"/>
+  </w:num>
+  <w:num w:numId="35" w16cid:durableId="863786821">
+    <w:abstractNumId w:val="20"/>
+  </w:num>
+  <w:num w:numId="36" w16cid:durableId="1482111924">
     <w:abstractNumId w:val="12"/>
   </w:num>
-  <w:num w:numId="10" w16cid:durableId="233635996">
-    <w:abstractNumId w:val="4"/>
+  <w:num w:numId="37" w16cid:durableId="354575966">
+    <w:abstractNumId w:val="10"/>
   </w:num>
-  <w:num w:numId="11" w16cid:durableId="678393355">
-    <w:abstractNumId w:val="13"/>
+  <w:num w:numId="38" w16cid:durableId="1137332931">
+    <w:abstractNumId w:val="25"/>
   </w:num>
-  <w:num w:numId="12" w16cid:durableId="1473400964">
-    <w:abstractNumId w:val="2"/>
+  <w:num w:numId="39" w16cid:durableId="1223053498">
+    <w:abstractNumId w:val="29"/>
   </w:num>
-  <w:num w:numId="13" w16cid:durableId="3747947">
-    <w:abstractNumId w:val="32"/>
-  </w:num>
-  <w:num w:numId="14" w16cid:durableId="1760905303">
-    <w:abstractNumId w:val="27"/>
-  </w:num>
-  <w:num w:numId="15" w16cid:durableId="41179656">
+  <w:num w:numId="40" w16cid:durableId="1813524534">
     <w:abstractNumId w:val="28"/>
   </w:num>
-  <w:num w:numId="16" w16cid:durableId="1724980417">
-    <w:abstractNumId w:val="25"/>
-  </w:num>
-  <w:num w:numId="17" w16cid:durableId="262499182">
-    <w:abstractNumId w:val="8"/>
-  </w:num>
-  <w:num w:numId="18" w16cid:durableId="1396001935">
-    <w:abstractNumId w:val="20"/>
-  </w:num>
-  <w:num w:numId="19" w16cid:durableId="741563133">
-    <w:abstractNumId w:val="30"/>
-  </w:num>
-  <w:num w:numId="20" w16cid:durableId="472645796">
-    <w:abstractNumId w:val="15"/>
-  </w:num>
-  <w:num w:numId="21" w16cid:durableId="834146167">
-    <w:abstractNumId w:val="23"/>
-  </w:num>
-  <w:num w:numId="22" w16cid:durableId="1771077427">
-    <w:abstractNumId w:val="19"/>
-  </w:num>
-  <w:num w:numId="23" w16cid:durableId="347222887">
-    <w:abstractNumId w:val="3"/>
-  </w:num>
-  <w:num w:numId="24" w16cid:durableId="601575226">
-    <w:abstractNumId w:val="9"/>
-  </w:num>
-  <w:num w:numId="25" w16cid:durableId="236943186">
-    <w:abstractNumId w:val="29"/>
-  </w:num>
-  <w:num w:numId="26" w16cid:durableId="641467891">
-    <w:abstractNumId w:val="26"/>
-  </w:num>
-  <w:num w:numId="27" w16cid:durableId="41487736">
-    <w:abstractNumId w:val="31"/>
-  </w:num>
-  <w:num w:numId="28" w16cid:durableId="1080713305">
-    <w:abstractNumId w:val="5"/>
-  </w:num>
-  <w:num w:numId="29" w16cid:durableId="1864399801">
-    <w:abstractNumId w:val="16"/>
-  </w:num>
-  <w:num w:numId="30" w16cid:durableId="762797186">
-    <w:abstractNumId w:val="11"/>
-  </w:num>
-  <w:num w:numId="31" w16cid:durableId="805586371">
-    <w:abstractNumId w:val="6"/>
-  </w:num>
-  <w:num w:numId="32" w16cid:durableId="310523437">
-    <w:abstractNumId w:val="7"/>
-  </w:num>
-  <w:num w:numId="33" w16cid:durableId="1100218768">
-    <w:abstractNumId w:val="14"/>
-  </w:num>
-  <w:num w:numId="34" w16cid:durableId="83109092">
-    <w:abstractNumId w:val="33"/>
-  </w:num>
-  <w:num w:numId="35" w16cid:durableId="863786821">
-    <w:abstractNumId w:val="17"/>
+  <w:num w:numId="41" w16cid:durableId="1072854327">
+    <w:abstractNumId w:val="2"/>
   </w:num>
 </w:numbering>
 </file>
@@ -6997,7 +7853,6 @@
   <w:style w:type="character" w:default="1" w:styleId="DefaultParagraphFont">
     <w:name w:val="Default Paragraph Font"/>
     <w:uiPriority w:val="1"/>
-    <w:semiHidden/>
     <w:unhideWhenUsed/>
   </w:style>
   <w:style w:type="table" w:default="1" w:styleId="TableNormal">

</xml_diff>